<commit_message>
Updated citation Project Context
</commit_message>
<xml_diff>
--- a/01_THESIS/Chapter 1/02_Project Context.docx
+++ b/01_THESIS/Chapter 1/02_Project Context.docx
@@ -99,18 +99,16 @@
           <w:sz w:val="24"/>
           <w:szCs w:val="24"/>
         </w:rPr>
-        <w:t xml:space="preserve">This manual approach to scoring, however, becomes difficult to sustain as the number of student submissions increases. A teacher handling several class sections may need to read and evaluate hundreds of </w:t>
-      </w:r>
-      <w:proofErr w:type="gramStart"/>
-      <w:r>
-        <w:rPr>
-          <w:rFonts w:ascii="Times New Roman" w:eastAsia="Times New Roman" w:hAnsi="Times New Roman" w:cs="Times New Roman"/>
-          <w:sz w:val="24"/>
-          <w:szCs w:val="24"/>
-        </w:rPr>
-        <w:t>essay</w:t>
-      </w:r>
-      <w:proofErr w:type="gramEnd"/>
+        <w:t>This manual approach to scoring, however, becomes difficult to sustain as the number of student submissions increases. A teacher handling several class sections may need to read and evaluate hundreds of essay</w:t>
+      </w:r>
+      <w:r>
+        <w:rPr>
+          <w:rFonts w:ascii="Times New Roman" w:eastAsia="Times New Roman" w:hAnsi="Times New Roman" w:cs="Times New Roman"/>
+          <w:sz w:val="24"/>
+          <w:szCs w:val="24"/>
+        </w:rPr>
+        <w:t>s</w:t>
+      </w:r>
       <w:r>
         <w:rPr>
           <w:rFonts w:ascii="Times New Roman" w:eastAsia="Times New Roman" w:hAnsi="Times New Roman" w:cs="Times New Roman"/>
@@ -182,7 +180,25 @@
           <w:sz w:val="24"/>
           <w:szCs w:val="24"/>
         </w:rPr>
-        <w:t xml:space="preserve"> have been used for decades to score essays for large-scale examinations, applying natural language processing techniques to analyze features such as grammar, organization, and content (Attali &amp; Burstein, 2006; Rudner, Garcia, &amp; Welch, 2006). More recently, general-purpose writing tools such as Grammarly, along with applications built around large language models, have also been used informally by some educators to check or comment on student writing. Systematic reviews of these developments show that AES research has grown from early statistical and rule-based systems into approaches that use machine learning and deep learning models to predict scores based on patterns learned from previously graded essays (Ramesh &amp; </w:t>
+        <w:t xml:space="preserve"> have been used for decades to score essays for large-scale examinations, applying natural language processing techniques to analyze features such as grammar, organization, and content (</w:t>
+      </w:r>
+      <w:proofErr w:type="spellStart"/>
+      <w:r>
+        <w:rPr>
+          <w:rFonts w:ascii="Times New Roman" w:eastAsia="Times New Roman" w:hAnsi="Times New Roman" w:cs="Times New Roman"/>
+          <w:sz w:val="24"/>
+          <w:szCs w:val="24"/>
+        </w:rPr>
+        <w:t>Ifenthaler</w:t>
+      </w:r>
+      <w:proofErr w:type="spellEnd"/>
+      <w:r>
+        <w:rPr>
+          <w:rFonts w:ascii="Times New Roman" w:eastAsia="Times New Roman" w:hAnsi="Times New Roman" w:cs="Times New Roman"/>
+          <w:sz w:val="24"/>
+          <w:szCs w:val="24"/>
+        </w:rPr>
+        <w:t xml:space="preserve">, 2023). More recently, general-purpose writing tools such as Grammarly, along with applications built around large language models, have also been used informally by some educators to check or comment on student writing. Systematic reviews of these developments show that AES research has grown from early statistical and rule-based systems into approaches that use machine learning and deep learning models to predict scores based on patterns learned from previously graded essays (Ramesh &amp; </w:t>
       </w:r>
       <w:proofErr w:type="spellStart"/>
       <w:r>
@@ -247,7 +263,25 @@
           <w:sz w:val="24"/>
           <w:szCs w:val="24"/>
         </w:rPr>
-        <w:t xml:space="preserve"> were primarily built for large-scale standardized examinations and are typically proprietary and costly to license, making them difficult for individual schools or teachers to adopt directly (Rudner, Garcia, &amp; Welch, 2006). Many of these systems are also not designed to connect with the Virtual Learning Environments (VLEs) that schools already use, and general-purpose writing tools are not built specifically to produce a scored result against a defined rubric or scoring scale. In addition, </w:t>
+        <w:t xml:space="preserve"> were primarily built for large-scale standardized examinations and are typically proprietary and costly to license, making them difficult for individual schools or teachers to adopt directly (</w:t>
+      </w:r>
+      <w:proofErr w:type="spellStart"/>
+      <w:r>
+        <w:rPr>
+          <w:rFonts w:ascii="Times New Roman" w:eastAsia="Times New Roman" w:hAnsi="Times New Roman" w:cs="Times New Roman"/>
+          <w:sz w:val="24"/>
+          <w:szCs w:val="24"/>
+        </w:rPr>
+        <w:t>Ifenthaler</w:t>
+      </w:r>
+      <w:proofErr w:type="spellEnd"/>
+      <w:r>
+        <w:rPr>
+          <w:rFonts w:ascii="Times New Roman" w:eastAsia="Times New Roman" w:hAnsi="Times New Roman" w:cs="Times New Roman"/>
+          <w:sz w:val="24"/>
+          <w:szCs w:val="24"/>
+        </w:rPr>
+        <w:t xml:space="preserve">, 2023). Many of these systems are also not designed to connect with the Virtual Learning Environments (VLEs) that schools already use, and general-purpose writing tools are not built specifically to produce a scored result against a defined rubric or scoring scale. In addition, an </w:t>
       </w:r>
       <w:r>
         <w:rPr>
@@ -256,7 +290,7 @@
           <w:szCs w:val="24"/>
         </w:rPr>
         <w:lastRenderedPageBreak/>
-        <w:t>an automated score should not completely replace a teacher's judgment, since students may give unique or unexpected answers that require human interpretation (Yang et al., 2024). These gaps indicate a need for a scoring tool that focuses primarily on essay scoring, that a teacher can access directly or connect to an existing VLE through an API, and that keeps a teacher's review as part of the scoring process rather than removing it.</w:t>
+        <w:t>automated score should not completely replace a teacher's judgment, since students may give unique or unexpected answers that require human interpretation (Yang et al., 2024). These gaps indicate a need for a scoring tool that focuses primarily on essay scoring, that a teacher can access directly or connect to an existing VLE through an API, and that keeps a teacher's review as part of the scoring process rather than removing it.</w:t>
       </w:r>
     </w:p>
     <w:p>
@@ -324,13 +358,23 @@
           <w:szCs w:val="24"/>
         </w:rPr>
       </w:pPr>
-      <w:r>
-        <w:rPr>
-          <w:rFonts w:ascii="Times New Roman" w:eastAsia="Times New Roman" w:hAnsi="Times New Roman" w:cs="Times New Roman"/>
-          <w:sz w:val="24"/>
-          <w:szCs w:val="24"/>
-        </w:rPr>
-        <w:t>Attali, Y., &amp; Burstein, J. (2006). Automated essay scoring with e-rater® v.2. The Journal of Technology, Learning and Assessment, 4(3).</w:t>
+      <w:proofErr w:type="spellStart"/>
+      <w:r>
+        <w:rPr>
+          <w:rFonts w:ascii="Times New Roman" w:eastAsia="Times New Roman" w:hAnsi="Times New Roman" w:cs="Times New Roman"/>
+          <w:sz w:val="24"/>
+          <w:szCs w:val="24"/>
+        </w:rPr>
+        <w:t>Ifenthaler</w:t>
+      </w:r>
+      <w:proofErr w:type="spellEnd"/>
+      <w:r>
+        <w:rPr>
+          <w:rFonts w:ascii="Times New Roman" w:eastAsia="Times New Roman" w:hAnsi="Times New Roman" w:cs="Times New Roman"/>
+          <w:sz w:val="24"/>
+          <w:szCs w:val="24"/>
+        </w:rPr>
+        <w:t>, D. (2023). Automated essay scoring systems. In O. Zawacki-Richter &amp; I. Jung (Eds.), Handbook of open, distance and digital education (pp. 1057–1071). Springer. https://doi.org/10.1007/978-981-19-2080-6_59</w:t>
       </w:r>
     </w:p>
     <w:p>
@@ -396,14 +440,6 @@
           <w:szCs w:val="24"/>
         </w:rPr>
       </w:pPr>
-      <w:r>
-        <w:rPr>
-          <w:rFonts w:ascii="Times New Roman" w:eastAsia="Times New Roman" w:hAnsi="Times New Roman" w:cs="Times New Roman"/>
-          <w:sz w:val="24"/>
-          <w:szCs w:val="24"/>
-        </w:rPr>
-        <w:t xml:space="preserve">Rudner, L. M., Garcia, V., &amp; Welch, C. (2006). An evaluation of the </w:t>
-      </w:r>
       <w:proofErr w:type="spellStart"/>
       <w:r>
         <w:rPr>
@@ -411,7 +447,7 @@
           <w:sz w:val="24"/>
           <w:szCs w:val="24"/>
         </w:rPr>
-        <w:t>IntelliMetric</w:t>
+        <w:t>Sutisna</w:t>
       </w:r>
       <w:proofErr w:type="spellEnd"/>
       <w:r>
@@ -420,7 +456,25 @@
           <w:sz w:val="24"/>
           <w:szCs w:val="24"/>
         </w:rPr>
-        <w:t>® essay scoring system using responses to GMAT analytical writing assessment prompts. Journal of Technology, Learning, and Assessment, 4(4), 1–21.</w:t>
+        <w:t xml:space="preserve">, M., </w:t>
+      </w:r>
+      <w:proofErr w:type="spellStart"/>
+      <w:r>
+        <w:rPr>
+          <w:rFonts w:ascii="Times New Roman" w:eastAsia="Times New Roman" w:hAnsi="Times New Roman" w:cs="Times New Roman"/>
+          <w:sz w:val="24"/>
+          <w:szCs w:val="24"/>
+        </w:rPr>
+        <w:t>Suryadi</w:t>
+      </w:r>
+      <w:proofErr w:type="spellEnd"/>
+      <w:r>
+        <w:rPr>
+          <w:rFonts w:ascii="Times New Roman" w:eastAsia="Times New Roman" w:hAnsi="Times New Roman" w:cs="Times New Roman"/>
+          <w:sz w:val="24"/>
+          <w:szCs w:val="24"/>
+        </w:rPr>
+        <w:t>, D., &amp; others. (2023). Automatic essay exam scoring system: A systematic literature review. Procedia Computer Science, 216, 551–560. https://doi.org/10.1016/j.procs.2022.12.166</w:t>
       </w:r>
     </w:p>
     <w:p>
@@ -432,6 +486,14 @@
           <w:szCs w:val="24"/>
         </w:rPr>
       </w:pPr>
+      <w:r>
+        <w:rPr>
+          <w:rFonts w:ascii="Times New Roman" w:eastAsia="Times New Roman" w:hAnsi="Times New Roman" w:cs="Times New Roman"/>
+          <w:sz w:val="24"/>
+          <w:szCs w:val="24"/>
+        </w:rPr>
+        <w:t xml:space="preserve">Yang, K., </w:t>
+      </w:r>
       <w:proofErr w:type="spellStart"/>
       <w:r>
         <w:rPr>
@@ -439,7 +501,7 @@
           <w:sz w:val="24"/>
           <w:szCs w:val="24"/>
         </w:rPr>
-        <w:t>Sutisna</w:t>
+        <w:t>Raković</w:t>
       </w:r>
       <w:proofErr w:type="spellEnd"/>
       <w:r>
@@ -448,7 +510,7 @@
           <w:sz w:val="24"/>
           <w:szCs w:val="24"/>
         </w:rPr>
-        <w:t xml:space="preserve">, M., </w:t>
+        <w:t xml:space="preserve">, M., Li, Y., Guan, Q., </w:t>
       </w:r>
       <w:proofErr w:type="spellStart"/>
       <w:r>
@@ -457,7 +519,7 @@
           <w:sz w:val="24"/>
           <w:szCs w:val="24"/>
         </w:rPr>
-        <w:t>Suryadi</w:t>
+        <w:t>Gašević</w:t>
       </w:r>
       <w:proofErr w:type="spellEnd"/>
       <w:r>
@@ -466,63 +528,10 @@
           <w:sz w:val="24"/>
           <w:szCs w:val="24"/>
         </w:rPr>
-        <w:t>, D., &amp; others. (2023). Automatic essay exam scoring system: A systematic literature review. Procedia Computer Science, 216, 551–560. https://doi.org/10.1016/j.procs.2022.12.166</w:t>
-      </w:r>
-    </w:p>
-    <w:p>
-      <w:pPr>
-        <w:ind w:left="720" w:hanging="720"/>
-        <w:rPr>
-          <w:rFonts w:ascii="Times New Roman" w:eastAsia="Times New Roman" w:hAnsi="Times New Roman" w:cs="Times New Roman"/>
-          <w:sz w:val="24"/>
-          <w:szCs w:val="24"/>
-        </w:rPr>
-      </w:pPr>
-      <w:r>
-        <w:rPr>
-          <w:rFonts w:ascii="Times New Roman" w:eastAsia="Times New Roman" w:hAnsi="Times New Roman" w:cs="Times New Roman"/>
-          <w:sz w:val="24"/>
-          <w:szCs w:val="24"/>
-        </w:rPr>
-        <w:t xml:space="preserve">Yang, K., </w:t>
-      </w:r>
-      <w:proofErr w:type="spellStart"/>
-      <w:r>
-        <w:rPr>
-          <w:rFonts w:ascii="Times New Roman" w:eastAsia="Times New Roman" w:hAnsi="Times New Roman" w:cs="Times New Roman"/>
-          <w:sz w:val="24"/>
-          <w:szCs w:val="24"/>
-        </w:rPr>
-        <w:t>Raković</w:t>
-      </w:r>
-      <w:proofErr w:type="spellEnd"/>
-      <w:r>
-        <w:rPr>
-          <w:rFonts w:ascii="Times New Roman" w:eastAsia="Times New Roman" w:hAnsi="Times New Roman" w:cs="Times New Roman"/>
-          <w:sz w:val="24"/>
-          <w:szCs w:val="24"/>
-        </w:rPr>
-        <w:t xml:space="preserve">, M., Li, Y., Guan, Q., </w:t>
-      </w:r>
-      <w:proofErr w:type="spellStart"/>
-      <w:r>
-        <w:rPr>
-          <w:rFonts w:ascii="Times New Roman" w:eastAsia="Times New Roman" w:hAnsi="Times New Roman" w:cs="Times New Roman"/>
-          <w:sz w:val="24"/>
-          <w:szCs w:val="24"/>
-        </w:rPr>
-        <w:t>Gašević</w:t>
-      </w:r>
-      <w:proofErr w:type="spellEnd"/>
-      <w:r>
-        <w:rPr>
-          <w:rFonts w:ascii="Times New Roman" w:eastAsia="Times New Roman" w:hAnsi="Times New Roman" w:cs="Times New Roman"/>
-          <w:sz w:val="24"/>
-          <w:szCs w:val="24"/>
-        </w:rPr>
         <w:t>, D., &amp; Chen, G. (2024). Unveiling the tapestry of automated essay scoring: A comprehensive investigation of accuracy, fairness, and generalizability. Proceedings of the AAAI Conference on Artificial Intelligence, 38(20), 22466–22474. https://doi.org/10.1609/aaai.v38i20.30254</w:t>
       </w:r>
     </w:p>
+    <w:p/>
     <w:p/>
     <w:sectPr>
       <w:pgSz w:w="12240" w:h="15840"/>

</xml_diff>